<commit_message>
chore: edições manuais nos templates de veículo
Co-Authored-By: Claude Opus 5 <noreply@anthropic.com>
</commit_message>
<xml_diff>
--- a/templates/contrato_veiculo.docx
+++ b/templates/contrato_veiculo.docx
@@ -1,6 +1,6 @@
 
 <file path=word/document.xml><?xml version="1.0" encoding="utf-8"?>
-<w:document xmlns:wpc="http://schemas.microsoft.com/office/word/2010/wordprocessingCanvas" xmlns:cx="http://schemas.microsoft.com/office/drawing/2014/chartex" xmlns:cx1="http://schemas.microsoft.com/office/drawing/2015/9/8/chartex" xmlns:cx2="http://schemas.microsoft.com/office/drawing/2015/10/21/chartex" xmlns:cx3="http://schemas.microsoft.com/office/drawing/2016/5/9/chartex" xmlns:cx4="http://schemas.microsoft.com/office/drawing/2016/5/10/chartex" xmlns:cx5="http://schemas.microsoft.com/office/drawing/2016/5/11/chartex" xmlns:cx6="http://schemas.microsoft.com/office/drawing/2016/5/12/chartex" xmlns:cx7="http://schemas.microsoft.com/office/drawing/2016/5/13/chartex" xmlns:cx8="http://schemas.microsoft.com/office/drawing/2016/5/14/chartex" xmlns:mc="http://schemas.openxmlformats.org/markup-compatibility/2006" xmlns:aink="http://schemas.microsoft.com/office/drawing/2016/ink" xmlns:am3d="http://schemas.microsoft.com/office/drawing/2017/model3d" xmlns:o="urn:schemas-microsoft-com:office:office" xmlns:r="http://schemas.openxmlformats.org/officeDocument/2006/relationships" xmlns:m="http://schemas.openxmlformats.org/officeDocument/2006/math" xmlns:v="urn:schemas-microsoft-com:vml" xmlns:wp14="http://schemas.microsoft.com/office/word/2010/wordprocessingDrawing" xmlns:wp="http://schemas.openxmlformats.org/drawingml/2006/wordprocessingDrawing" xmlns:w10="urn:schemas-microsoft-com:office:word" xmlns:w="http://schemas.openxmlformats.org/wordprocessingml/2006/main" xmlns:w14="http://schemas.microsoft.com/office/word/2010/wordml" xmlns:w15="http://schemas.microsoft.com/office/word/2012/wordml" xmlns:w16cid="http://schemas.microsoft.com/office/word/2016/wordml/cid" xmlns:w16se="http://schemas.microsoft.com/office/word/2015/wordml/symex" xmlns:wpg="http://schemas.microsoft.com/office/word/2010/wordprocessingGroup" xmlns:wpi="http://schemas.microsoft.com/office/word/2010/wordprocessingInk" xmlns:wne="http://schemas.microsoft.com/office/word/2006/wordml" xmlns:wps="http://schemas.microsoft.com/office/word/2010/wordprocessingShape" mc:Ignorable="w14 w15 w16se w16cid wp14">
+<w:document xmlns:wpc="http://schemas.microsoft.com/office/word/2010/wordprocessingCanvas" xmlns:cx="http://schemas.microsoft.com/office/drawing/2014/chartex" xmlns:cx1="http://schemas.microsoft.com/office/drawing/2015/9/8/chartex" xmlns:cx2="http://schemas.microsoft.com/office/drawing/2015/10/21/chartex" xmlns:cx3="http://schemas.microsoft.com/office/drawing/2016/5/9/chartex" xmlns:cx4="http://schemas.microsoft.com/office/drawing/2016/5/10/chartex" xmlns:cx5="http://schemas.microsoft.com/office/drawing/2016/5/11/chartex" xmlns:cx6="http://schemas.microsoft.com/office/drawing/2016/5/12/chartex" xmlns:cx7="http://schemas.microsoft.com/office/drawing/2016/5/13/chartex" xmlns:cx8="http://schemas.microsoft.com/office/drawing/2016/5/14/chartex" xmlns:mc="http://schemas.openxmlformats.org/markup-compatibility/2006" xmlns:aink="http://schemas.microsoft.com/office/drawing/2016/ink" xmlns:am3d="http://schemas.microsoft.com/office/drawing/2017/model3d" xmlns:o="urn:schemas-microsoft-com:office:office" xmlns:oel="http://schemas.microsoft.com/office/2019/extlst" xmlns:r="http://schemas.openxmlformats.org/officeDocument/2006/relationships" xmlns:m="http://schemas.openxmlformats.org/officeDocument/2006/math" xmlns:v="urn:schemas-microsoft-com:vml" xmlns:wp14="http://schemas.microsoft.com/office/word/2010/wordprocessingDrawing" xmlns:wp="http://schemas.openxmlformats.org/drawingml/2006/wordprocessingDrawing" xmlns:w10="urn:schemas-microsoft-com:office:word" xmlns:w="http://schemas.openxmlformats.org/wordprocessingml/2006/main" xmlns:w14="http://schemas.microsoft.com/office/word/2010/wordml" xmlns:w15="http://schemas.microsoft.com/office/word/2012/wordml" xmlns:w16cei="http://schemas.microsoft.com/office/word/2026/wordml/cei" xmlns:w16cex="http://schemas.microsoft.com/office/word/2018/wordml/cex" xmlns:w16cid="http://schemas.microsoft.com/office/word/2016/wordml/cid" xmlns:w16="http://schemas.microsoft.com/office/word/2018/wordml" xmlns:w16du="http://schemas.microsoft.com/office/word/2023/wordml/word16du" xmlns:w16sdtdh="http://schemas.microsoft.com/office/word/2020/wordml/sdtdatahash" xmlns:w16sdtfl="http://schemas.microsoft.com/office/word/2024/wordml/sdtformatlock" xmlns:w16se="http://schemas.microsoft.com/office/word/2015/wordml/symex" xmlns:wpg="http://schemas.microsoft.com/office/word/2010/wordprocessingGroup" xmlns:wpi="http://schemas.microsoft.com/office/word/2010/wordprocessingInk" xmlns:wne="http://schemas.microsoft.com/office/word/2006/wordml" xmlns:wps="http://schemas.microsoft.com/office/word/2010/wordprocessingShape" mc:Ignorable="w14 w15 w16se w16cid w16 w16cex w16sdtdh w16sdtfl w16du wp14">
   <w:body>
     <w:p>
       <w:pPr>
@@ -85,6 +85,16 @@
         </w:rPr>
         <w:t xml:space="preserve">, portador do RG nº </w:t>
       </w:r>
+      <w:r>
+        <w:rPr>
+          <w:b/>
+          <w:bCs/>
+          <w:color w:val="000000"/>
+          <w:sz w:val="24"/>
+          <w:szCs w:val="24"/>
+        </w:rPr>
+        <w:t xml:space="preserve">{{ </w:t>
+      </w:r>
       <w:proofErr w:type="spellStart"/>
       <w:r>
         <w:rPr>
@@ -94,7 +104,7 @@
           <w:sz w:val="24"/>
           <w:szCs w:val="24"/>
         </w:rPr>
-        <w:t>{{ rg }}</w:t>
+        <w:t>rg</w:t>
       </w:r>
       <w:proofErr w:type="spellEnd"/>
       <w:r>
@@ -105,6 +115,7 @@
           <w:sz w:val="24"/>
           <w:szCs w:val="24"/>
         </w:rPr>
+        <w:t xml:space="preserve"> }}</w:t>
       </w:r>
       <w:r>
         <w:rPr>
@@ -130,15 +141,7 @@
           <w:sz w:val="24"/>
           <w:szCs w:val="24"/>
         </w:rPr>
-        <w:t>, re</w:t>
-      </w:r>
-      <w:r>
-        <w:rPr>
-          <w:color w:val="000000"/>
-          <w:sz w:val="24"/>
-          <w:szCs w:val="24"/>
-        </w:rPr>
-        <w:t xml:space="preserve">sidente e domiciliado na </w:t>
+        <w:t xml:space="preserve">, residente e domiciliado na </w:t>
       </w:r>
       <w:r>
         <w:rPr>
@@ -210,23 +213,7 @@
           <w:sz w:val="24"/>
           <w:szCs w:val="24"/>
         </w:rPr>
-        <w:t>, inscrita no C</w:t>
-      </w:r>
-      <w:r>
-        <w:rPr>
-          <w:color w:val="000000"/>
-          <w:sz w:val="24"/>
-          <w:szCs w:val="24"/>
-        </w:rPr>
-        <w:t xml:space="preserve">NPJ/MF sob o nº 60.941.780/0001-04, com sede estabelecida na Estrada do Pau Ferro, nº 480, Bloco 1, Sala </w:t>
-      </w:r>
-      <w:r>
-        <w:rPr>
-          <w:color w:val="000000"/>
-          <w:sz w:val="24"/>
-          <w:szCs w:val="24"/>
-        </w:rPr>
-        <w:t>2</w:t>
+        <w:t>, inscrita no CNPJ/MF sob o nº 60.941.780/0001-04, com sede estabelecida na Estrada do Pau Ferro, nº 480, Bloco 1, Sala 2</w:t>
       </w:r>
       <w:r>
         <w:rPr>
@@ -252,17 +239,7 @@
           <w:sz w:val="24"/>
           <w:szCs w:val="24"/>
         </w:rPr>
-        <w:t>BLINDSA</w:t>
-      </w:r>
-      <w:r>
-        <w:rPr>
-          <w:b/>
-          <w:bCs/>
-          <w:color w:val="000000"/>
-          <w:sz w:val="24"/>
-          <w:szCs w:val="24"/>
-        </w:rPr>
-        <w:t>FE</w:t>
+        <w:t>BLINDSAFE</w:t>
       </w:r>
       <w:r>
         <w:rPr>
@@ -300,17 +277,7 @@
           <w:sz w:val="24"/>
           <w:szCs w:val="24"/>
         </w:rPr>
-        <w:t>CL</w:t>
-      </w:r>
-      <w:r>
-        <w:rPr>
-          <w:b/>
-          <w:bCs/>
-          <w:color w:val="000000"/>
-          <w:sz w:val="24"/>
-          <w:szCs w:val="24"/>
-        </w:rPr>
-        <w:t>ÁUSULA PRIMEIRA – DO OBJETO CONTRATUAL E DA REPRESENTAÇÃO JUDICIAL</w:t>
+        <w:t>CLÁUSULA PRIMEIRA – DO OBJETO CONTRATUAL E DA REPRESENTAÇÃO JUDICIAL</w:t>
       </w:r>
     </w:p>
     <w:p>
@@ -335,15 +302,7 @@
           <w:sz w:val="24"/>
           <w:szCs w:val="24"/>
         </w:rPr>
-        <w:t xml:space="preserve">O presente contrato tem por objeto fundamental a prestação de serviços especializados de assessoria, consultoria técnica em contratos financeiros, recuperação de crédito e conciliação </w:t>
-      </w:r>
-      <w:r>
-        <w:rPr>
-          <w:color w:val="000000"/>
-          <w:sz w:val="24"/>
-          <w:szCs w:val="24"/>
-        </w:rPr>
-        <w:t xml:space="preserve">bancária, com foco específico na atuação técnica e estratégica visando à composição amigável ou ao reconhecimento judicial de eventuais abusividades contratuais que oneram o débito do </w:t>
+        <w:t xml:space="preserve">O presente contrato tem por objeto fundamental a prestação de serviços especializados de assessoria, consultoria técnica em contratos financeiros, recuperação de crédito e conciliação bancária, com foco específico na atuação técnica e estratégica visando à composição amigável ou ao reconhecimento judicial de eventuais abusividades contratuais que oneram o débito do </w:t>
       </w:r>
       <w:r>
         <w:rPr>
@@ -404,23 +363,7 @@
           <w:sz w:val="24"/>
           <w:szCs w:val="24"/>
         </w:rPr>
-        <w:t xml:space="preserve"> compreende a </w:t>
-      </w:r>
-      <w:r>
-        <w:rPr>
-          <w:color w:val="000000"/>
-          <w:sz w:val="24"/>
-          <w:szCs w:val="24"/>
-        </w:rPr>
-        <w:t>análise técnica detalhada do contrato de financiamento originário, a elaboração e o protocolo de peças de defesa judicial, a interposição de recursos, a participação em audiências, caso ocorram, e a gestão estratégica do passivo financeiro junto à institui</w:t>
-      </w:r>
-      <w:r>
-        <w:rPr>
-          <w:color w:val="000000"/>
-          <w:sz w:val="24"/>
-          <w:szCs w:val="24"/>
-        </w:rPr>
-        <w:t xml:space="preserve">ção credora. Todo o serviço jurídico prestado será através de advogados parceiros e custeados pela </w:t>
+        <w:t xml:space="preserve"> compreende a análise técnica detalhada do contrato de financiamento originário, a elaboração e o protocolo de peças de defesa judicial, a interposição de recursos, a participação em audiências, caso ocorram, e a gestão estratégica do passivo financeiro junto à instituição credora. Todo o serviço jurídico prestado será através de advogados parceiros e custeados pela </w:t>
       </w:r>
       <w:r>
         <w:rPr>
@@ -481,15 +424,7 @@
           <w:sz w:val="24"/>
           <w:szCs w:val="24"/>
         </w:rPr>
-        <w:t xml:space="preserve"> obriga-se a disponibilizar seu corpo técnico e jurídico, bem como escritórios de advocacia parceiros devidamente habilitados, pa</w:t>
-      </w:r>
-      <w:r>
-        <w:rPr>
-          <w:color w:val="000000"/>
-          <w:sz w:val="24"/>
-          <w:szCs w:val="24"/>
-        </w:rPr>
-        <w:t xml:space="preserve">ra a defesa intransigente dos interesses do </w:t>
+        <w:t xml:space="preserve"> obriga-se a disponibilizar seu corpo técnico e jurídico, bem como escritórios de advocacia parceiros devidamente habilitados, para a defesa intransigente dos interesses do </w:t>
       </w:r>
       <w:r>
         <w:rPr>
@@ -523,17 +458,7 @@
           <w:sz w:val="24"/>
           <w:szCs w:val="24"/>
         </w:rPr>
-        <w:t>CLÁUSULA SEGUNDA – DA FOR</w:t>
-      </w:r>
-      <w:r>
-        <w:rPr>
-          <w:b/>
-          <w:bCs/>
-          <w:color w:val="000000"/>
-          <w:sz w:val="24"/>
-          <w:szCs w:val="24"/>
-        </w:rPr>
-        <w:t>MA DE PAGAMENTO E DA DAÇÃO EM PAGAMENTO</w:t>
+        <w:t>CLÁUSULA SEGUNDA – DA FORMA DE PAGAMENTO E DA DAÇÃO EM PAGAMENTO</w:t>
       </w:r>
     </w:p>
     <w:p>
@@ -612,15 +537,7 @@
           <w:sz w:val="24"/>
           <w:szCs w:val="24"/>
         </w:rPr>
-        <w:t xml:space="preserve"> </w:t>
-      </w:r>
-      <w:r>
-        <w:rPr>
-          <w:color w:val="000000"/>
-          <w:sz w:val="24"/>
-          <w:szCs w:val="24"/>
-        </w:rPr>
-        <w:t xml:space="preserve">aceita, na forma de </w:t>
+        <w:t xml:space="preserve"> aceita, na forma de </w:t>
       </w:r>
       <w:r>
         <w:rPr>
@@ -705,147 +622,17 @@
           <w:sz w:val="24"/>
           <w:szCs w:val="24"/>
         </w:rPr>
-        <w:t xml:space="preserve">O bem objeto da dação </w:t>
-      </w:r>
-      <w:r>
-        <w:rPr>
-          <w:color w:val="000000"/>
-          <w:sz w:val="24"/>
-          <w:szCs w:val="24"/>
-        </w:rPr>
-        <w:t xml:space="preserve">em pagamento consiste em: </w:t>
-      </w:r>
-      <w:r>
-        <w:rPr>
-          <w:b/>
-          <w:bCs/>
-          <w:color w:val="000000"/>
-          <w:sz w:val="24"/>
-          <w:szCs w:val="24"/>
-        </w:rPr>
-        <w:t xml:space="preserve">MARCA/MODELO: </w:t>
-      </w:r>
-      <w:r>
-        <w:rPr>
-          <w:b/>
-          <w:bCs/>
-          <w:color w:val="000000"/>
-          <w:sz w:val="24"/>
-          <w:szCs w:val="24"/>
-        </w:rPr>
-        <w:t>{{ veiculo_modelo }}</w:t>
-      </w:r>
-      <w:r>
-        <w:rPr>
-          <w:b/>
-          <w:bCs/>
-          <w:color w:val="000000"/>
-          <w:sz w:val="24"/>
-          <w:szCs w:val="24"/>
-        </w:rPr>
-        <w:t xml:space="preserve">; ANO DE FABRICAÇÃO/MODELO: </w:t>
-      </w:r>
-      <w:r>
-        <w:rPr>
-          <w:b/>
-          <w:bCs/>
-          <w:color w:val="000000"/>
-          <w:sz w:val="24"/>
-          <w:szCs w:val="24"/>
-        </w:rPr>
-        <w:t>{{ veiculo_ano }}</w:t>
-      </w:r>
-      <w:r>
-        <w:rPr>
-          <w:b/>
-          <w:bCs/>
-          <w:color w:val="000000"/>
-          <w:sz w:val="24"/>
-          <w:szCs w:val="24"/>
-        </w:rPr>
-        <w:t xml:space="preserve">; COR: </w:t>
-      </w:r>
-      <w:r>
-        <w:rPr>
-          <w:b/>
-          <w:bCs/>
-          <w:color w:val="000000"/>
-          <w:sz w:val="24"/>
-          <w:szCs w:val="24"/>
-        </w:rPr>
-        <w:t>{{ veiculo_cor }}</w:t>
-      </w:r>
-      <w:r>
-        <w:rPr>
-          <w:b/>
-          <w:bCs/>
-          <w:color w:val="000000"/>
-          <w:sz w:val="24"/>
-          <w:szCs w:val="24"/>
-        </w:rPr>
-        <w:t xml:space="preserve">; CHASSI: </w:t>
-      </w:r>
-      <w:r>
-        <w:rPr>
-          <w:b/>
-          <w:bCs/>
-          <w:color w:val="000000"/>
-          <w:sz w:val="24"/>
-          <w:szCs w:val="24"/>
-        </w:rPr>
-        <w:t>{{ veiculo_chassi }}</w:t>
-      </w:r>
-      <w:r>
-        <w:rPr>
-          <w:b/>
-          <w:bCs/>
-          <w:color w:val="000000"/>
-          <w:sz w:val="24"/>
-          <w:szCs w:val="24"/>
-        </w:rPr>
-        <w:t xml:space="preserve">; PLACA: </w:t>
-      </w:r>
-      <w:r>
-        <w:rPr>
-          <w:b/>
-          <w:bCs/>
-          <w:color w:val="000000"/>
-          <w:sz w:val="24"/>
-          <w:szCs w:val="24"/>
-        </w:rPr>
-        <w:t>{{ veiculo_placa }}</w:t>
-      </w:r>
-      <w:r>
-        <w:rPr>
-          <w:b/>
-          <w:bCs/>
-          <w:color w:val="000000"/>
-          <w:sz w:val="24"/>
-          <w:szCs w:val="24"/>
-        </w:rPr>
-        <w:t>;</w:t>
-      </w:r>
-      <w:bookmarkStart w:id="0" w:name="_GoBack"/>
-      <w:bookmarkEnd w:id="0"/>
-      <w:r>
-        <w:rPr>
-          <w:b/>
-          <w:bCs/>
-          <w:color w:val="000000"/>
-          <w:sz w:val="24"/>
-          <w:szCs w:val="24"/>
-        </w:rPr>
-        <w:t xml:space="preserve"> RENAVAM: </w:t>
-      </w:r>
-      <w:r>
-        <w:rPr>
-          <w:b/>
-          <w:bCs/>
-          <w:color w:val="000000"/>
-          <w:sz w:val="24"/>
-          <w:szCs w:val="24"/>
-        </w:rPr>
-        <w:t>{{ veiculo_renavam }}</w:t>
+        <w:t xml:space="preserve">O bem objeto da dação em pagamento consiste em: </w:t>
+      </w:r>
+      <w:r>
+        <w:rPr>
+          <w:b/>
+          <w:bCs/>
+          <w:color w:val="000000"/>
+          <w:sz w:val="24"/>
+          <w:szCs w:val="24"/>
+        </w:rPr>
+        <w:t>MARCA/MODELO: {{ veiculo_modelo }}; ANO DE FABRICAÇÃO/MODELO: {{ veiculo_ano }}; COR: {{ veiculo_cor }}; CHASSI: {{ veiculo_chassi }}; PLACA: {{ veiculo_placa }}; RENAVAM: {{ veiculo_renavam }}</w:t>
       </w:r>
       <w:r>
         <w:rPr>
@@ -863,7 +650,6 @@
           <w:sz w:val="24"/>
           <w:szCs w:val="24"/>
         </w:rPr>
-        <w:lastRenderedPageBreak/>
         <w:t>CONTRATANTE</w:t>
       </w:r>
       <w:r>
@@ -897,15 +683,7 @@
           <w:sz w:val="24"/>
           <w:szCs w:val="24"/>
         </w:rPr>
-        <w:t>A transferência do veículo como pa</w:t>
-      </w:r>
-      <w:r>
-        <w:rPr>
-          <w:color w:val="000000"/>
-          <w:sz w:val="24"/>
-          <w:szCs w:val="24"/>
-        </w:rPr>
-        <w:t xml:space="preserve">gamento dos serviços de assessoria e representação jurídica possui caráter definitivo, operando-se a quitação das obrigações do </w:t>
+        <w:t xml:space="preserve">A transferência do veículo como pagamento dos serviços de assessoria e representação jurídica possui caráter definitivo, operando-se a quitação das obrigações do </w:t>
       </w:r>
       <w:r>
         <w:rPr>
@@ -923,7 +701,16 @@
           <w:sz w:val="24"/>
           <w:szCs w:val="24"/>
         </w:rPr>
-        <w:t xml:space="preserve"> perante a </w:t>
+        <w:t xml:space="preserve"> </w:t>
+      </w:r>
+      <w:r>
+        <w:rPr>
+          <w:color w:val="000000"/>
+          <w:sz w:val="24"/>
+          <w:szCs w:val="24"/>
+        </w:rPr>
+        <w:lastRenderedPageBreak/>
+        <w:t xml:space="preserve">perante a </w:t>
       </w:r>
       <w:r>
         <w:rPr>
@@ -941,15 +728,7 @@
           <w:sz w:val="24"/>
           <w:szCs w:val="24"/>
         </w:rPr>
-        <w:t xml:space="preserve"> no momento da tradição do bem e da entrega da documentação pertinente, sendo que a partir deste</w:t>
-      </w:r>
-      <w:r>
-        <w:rPr>
-          <w:color w:val="000000"/>
-          <w:sz w:val="24"/>
-          <w:szCs w:val="24"/>
-        </w:rPr>
-        <w:t xml:space="preserve"> ato, a </w:t>
+        <w:t xml:space="preserve"> no momento da tradição do bem e da entrega da documentação pertinente, sendo que a partir deste ato, a </w:t>
       </w:r>
       <w:r>
         <w:rPr>
@@ -1026,23 +805,7 @@
           <w:sz w:val="24"/>
           <w:szCs w:val="24"/>
         </w:rPr>
-        <w:t xml:space="preserve"> obriga-se, no ato da assinatura deste instrumento ou </w:t>
-      </w:r>
-      <w:r>
-        <w:rPr>
-          <w:color w:val="000000"/>
-          <w:sz w:val="24"/>
-          <w:szCs w:val="24"/>
-        </w:rPr>
-        <w:t>em prazo máximo de 48 (quarenta e oito) horas, a realizar a entrega das chaves, do veículo e de toda a documentação necessária para a plena fruição e futura transferência de propriedade, incluindo, mas não se limitando, ao Certificado de Registro de Veícul</w:t>
-      </w:r>
-      <w:r>
-        <w:rPr>
-          <w:color w:val="000000"/>
-          <w:sz w:val="24"/>
-          <w:szCs w:val="24"/>
-        </w:rPr>
-        <w:t>o (CRV) ou à Autorização para Transferência de Propriedade de Veículo Digital (</w:t>
+        <w:t xml:space="preserve"> obriga-se, no ato da assinatura deste instrumento ou em prazo máximo de 48 (quarenta e oito) horas, a realizar a entrega das chaves, do veículo e de toda a documentação necessária para a plena fruição e futura transferência de propriedade, incluindo, mas não se limitando, ao Certificado de Registro de Veículo (CRV) ou à Autorização para Transferência de Propriedade de Veículo Digital (</w:t>
       </w:r>
       <w:proofErr w:type="spellStart"/>
       <w:r>
@@ -1085,15 +848,7 @@
           <w:sz w:val="24"/>
           <w:szCs w:val="24"/>
         </w:rPr>
-        <w:t>Eventuais débitos de natureza tributária ou administrativ</w:t>
-      </w:r>
-      <w:r>
-        <w:rPr>
-          <w:color w:val="000000"/>
-          <w:sz w:val="24"/>
-          <w:szCs w:val="24"/>
-        </w:rPr>
-        <w:t xml:space="preserve">a, tais como IPVA, licenciamento e multas de trânsito cujos fatos geradores sejam anteriores à data de entrega do veículo e da assinatura deste contrato, são de inteira e exclusiva responsabilidade do </w:t>
+        <w:t xml:space="preserve">Eventuais débitos de natureza tributária ou administrativa, tais como IPVA, licenciamento e multas de trânsito cujos fatos geradores sejam anteriores à data de entrega do veículo e da assinatura deste contrato, são de inteira e exclusiva responsabilidade do </w:t>
       </w:r>
       <w:r>
         <w:rPr>
@@ -1111,15 +866,7 @@
           <w:sz w:val="24"/>
           <w:szCs w:val="24"/>
         </w:rPr>
-        <w:t>, devendo ser por este liquidados imediatame</w:t>
-      </w:r>
-      <w:r>
-        <w:rPr>
-          <w:color w:val="000000"/>
-          <w:sz w:val="24"/>
-          <w:szCs w:val="24"/>
-        </w:rPr>
-        <w:t xml:space="preserve">nte ou descontados do valor de avaliação do bem para fins desta dação, a critério da </w:t>
+        <w:t xml:space="preserve">, devendo ser por este liquidados imediatamente ou descontados do valor de avaliação do bem para fins desta dação, a critério da </w:t>
       </w:r>
       <w:r>
         <w:rPr>
@@ -1180,15 +927,7 @@
           <w:sz w:val="24"/>
           <w:szCs w:val="24"/>
         </w:rPr>
-        <w:t xml:space="preserve"> declara-se ciente de que o veículo possui restrição de alienação fiduciária, assumindo para si o ônus de gerir a liberação desse gravame junt</w:t>
-      </w:r>
-      <w:r>
-        <w:rPr>
-          <w:color w:val="000000"/>
-          <w:sz w:val="24"/>
-          <w:szCs w:val="24"/>
-        </w:rPr>
-        <w:t xml:space="preserve">o à instituição financeira em momento que considerar oportuno, ficando o </w:t>
+        <w:t xml:space="preserve"> declara-se ciente de que o veículo possui restrição de alienação fiduciária, assumindo para si o ônus de gerir a liberação desse gravame junto à instituição financeira em momento que considerar oportuno, ficando o </w:t>
       </w:r>
       <w:r>
         <w:rPr>
@@ -1222,17 +961,7 @@
           <w:sz w:val="24"/>
           <w:szCs w:val="24"/>
         </w:rPr>
-        <w:t>CLÁUSULA QUARTA – DA NEGOCIAÇÃO COM A INSTITUIÇÃ</w:t>
-      </w:r>
-      <w:r>
-        <w:rPr>
-          <w:b/>
-          <w:bCs/>
-          <w:color w:val="000000"/>
-          <w:sz w:val="24"/>
-          <w:szCs w:val="24"/>
-        </w:rPr>
-        <w:t>O FINANCEIRA E PRAZOS</w:t>
+        <w:t>CLÁUSULA QUARTA – DA NEGOCIAÇÃO COM A INSTITUIÇÃO FINANCEIRA E PRAZOS</w:t>
       </w:r>
     </w:p>
     <w:p>
@@ -1275,15 +1004,7 @@
           <w:sz w:val="24"/>
           <w:szCs w:val="24"/>
         </w:rPr>
-        <w:t xml:space="preserve"> assume o compromisso de buscar a quitação integral do contrato de financiamento junto à instituição financeira, utilizando-se de sua expertise em negociação de ativos e gestão de passivos bancários, arcando com os cu</w:t>
-      </w:r>
-      <w:r>
-        <w:rPr>
-          <w:color w:val="000000"/>
-          <w:sz w:val="24"/>
-          <w:szCs w:val="24"/>
-        </w:rPr>
-        <w:t>stos necessários para tal encerramento em momento oportuno, conforme critérios de viabilidade financeira próprios da empresa.</w:t>
+        <w:t xml:space="preserve"> assume o compromisso de buscar a quitação integral do contrato de financiamento junto à instituição financeira, utilizando-se de sua expertise em negociação de ativos e gestão de passivos bancários, arcando com os custos necessários para tal encerramento em momento oportuno, conforme critérios de viabilidade financeira próprios da empresa.</w:t>
       </w:r>
     </w:p>
     <w:p>
@@ -1326,15 +1047,7 @@
           <w:sz w:val="24"/>
           <w:szCs w:val="24"/>
         </w:rPr>
-        <w:t xml:space="preserve"> declara plena ciência e concordância de que a negociação com a instituição financeira depende de variáveis exte</w:t>
-      </w:r>
-      <w:r>
-        <w:rPr>
-          <w:color w:val="000000"/>
-          <w:sz w:val="24"/>
-          <w:szCs w:val="24"/>
-        </w:rPr>
-        <w:t xml:space="preserve">rnas, como políticas de recuperação de crédito do banco e cenários econômicos, de modo que </w:t>
+        <w:t xml:space="preserve"> declara plena ciência e concordância de que a negociação com a instituição financeira depende de variáveis externas, como políticas de recuperação de crédito do banco e cenários econômicos, de modo que </w:t>
       </w:r>
       <w:r>
         <w:rPr>
@@ -1352,15 +1065,7 @@
           <w:sz w:val="24"/>
           <w:szCs w:val="24"/>
         </w:rPr>
-        <w:t xml:space="preserve"> ao direito de reclamar ou questionar a demora na conclusão da negociação, na quitação do débito bancário ou na retirada do gravame do veículo,</w:t>
-      </w:r>
-      <w:r>
-        <w:rPr>
-          <w:color w:val="000000"/>
-          <w:sz w:val="24"/>
-          <w:szCs w:val="24"/>
-        </w:rPr>
-        <w:t xml:space="preserve"> reconhecendo que a </w:t>
+        <w:t xml:space="preserve"> ao direito de reclamar ou questionar a demora na conclusão da negociação, na quitação do débito bancário ou na retirada do gravame do veículo, reconhecendo que a </w:t>
       </w:r>
       <w:r>
         <w:rPr>
@@ -1421,15 +1126,7 @@
           <w:sz w:val="24"/>
           <w:szCs w:val="24"/>
         </w:rPr>
-        <w:t xml:space="preserve"> reconhece que não possui mais qualquer direito sobre o bem ou sobre os valo</w:t>
-      </w:r>
-      <w:r>
-        <w:rPr>
-          <w:color w:val="000000"/>
-          <w:sz w:val="24"/>
-          <w:szCs w:val="24"/>
-        </w:rPr>
-        <w:t xml:space="preserve">res eventualmente obtidos pela </w:t>
+        <w:t xml:space="preserve"> reconhece que não possui mais qualquer direito sobre o bem ou sobre os valores eventualmente obtidos pela </w:t>
       </w:r>
       <w:r>
         <w:rPr>
@@ -1490,15 +1187,7 @@
           <w:sz w:val="24"/>
           <w:szCs w:val="24"/>
         </w:rPr>
-        <w:t xml:space="preserve"> assume expressamente a responsabilidade pela quitação da dívida</w:t>
-      </w:r>
-      <w:r>
-        <w:rPr>
-          <w:color w:val="000000"/>
-          <w:sz w:val="24"/>
-          <w:szCs w:val="24"/>
-        </w:rPr>
-        <w:t xml:space="preserve"> e, após a referida liquidação, obriga-se a realizar todos os trâmites técnicos e legais necessários para a baixa das restrições creditícias nos órgãos de proteção ao crédito (SPC, SERASA e congêneres) em nome da </w:t>
+        <w:t xml:space="preserve"> assume expressamente a responsabilidade pela quitação da dívida e, após a referida liquidação, obriga-se a realizar todos os trâmites técnicos e legais necessários para a baixa das restrições creditícias nos órgãos de proteção ao crédito (SPC, SERASA e congêneres) em nome da </w:t>
       </w:r>
       <w:r>
         <w:rPr>
@@ -1516,15 +1205,7 @@
           <w:sz w:val="24"/>
           <w:szCs w:val="24"/>
         </w:rPr>
-        <w:t>, desde que tais restrições seja</w:t>
-      </w:r>
-      <w:r>
-        <w:rPr>
-          <w:color w:val="000000"/>
-          <w:sz w:val="24"/>
-          <w:szCs w:val="24"/>
-        </w:rPr>
-        <w:t>m exclusivamente decorrentes do débito referente ao veículo objeto deste contrato.</w:t>
+        <w:t>, desde que tais restrições sejam exclusivamente decorrentes do débito referente ao veículo objeto deste contrato.</w:t>
       </w:r>
     </w:p>
     <w:p>
@@ -1540,7 +1221,6 @@
           <w:sz w:val="24"/>
           <w:szCs w:val="24"/>
         </w:rPr>
-        <w:lastRenderedPageBreak/>
         <w:t>CLÁUSULA QUINTA – DAS OBRIGAÇÕES DO CONTRATANTE</w:t>
       </w:r>
     </w:p>
@@ -1637,17 +1317,7 @@
           <w:sz w:val="24"/>
           <w:szCs w:val="24"/>
         </w:rPr>
-        <w:t>CO</w:t>
-      </w:r>
-      <w:r>
-        <w:rPr>
-          <w:b/>
-          <w:bCs/>
-          <w:color w:val="000000"/>
-          <w:sz w:val="24"/>
-          <w:szCs w:val="24"/>
-        </w:rPr>
-        <w:t>NTRATANTE</w:t>
+        <w:t>CONTRATANTE</w:t>
       </w:r>
       <w:r>
         <w:rPr>
@@ -1691,15 +1361,7 @@
           <w:sz w:val="24"/>
           <w:szCs w:val="24"/>
         </w:rPr>
-        <w:t>, inclusive poderes especiais para transigir, desistir, receber e dar quitação, substabelecer com ou se</w:t>
-      </w:r>
-      <w:r>
-        <w:rPr>
-          <w:color w:val="000000"/>
-          <w:sz w:val="24"/>
-          <w:szCs w:val="24"/>
-        </w:rPr>
-        <w:t>m reserva de poderes, visando à plena execução do objeto deste contrato.</w:t>
+        <w:t>, inclusive poderes especiais para transigir, desistir, receber e dar quitação, substabelecer com ou sem reserva de poderes, visando à plena execução do objeto deste contrato.</w:t>
       </w:r>
     </w:p>
     <w:p>
@@ -1742,15 +1404,7 @@
           <w:sz w:val="24"/>
           <w:szCs w:val="24"/>
         </w:rPr>
-        <w:t xml:space="preserve"> a não realizar qualquer tipo de contato direto com a instituição financeira ou com seus escritórios de cobrança terceirizados sem o prévio e expresso </w:t>
-      </w:r>
-      <w:r>
-        <w:rPr>
-          <w:color w:val="000000"/>
-          <w:sz w:val="24"/>
-          <w:szCs w:val="24"/>
-        </w:rPr>
-        <w:t xml:space="preserve">consentimento da </w:t>
+        <w:t xml:space="preserve"> a não realizar qualquer tipo de contato direto com a instituição financeira ou com seus escritórios de cobrança terceirizados sem o prévio e expresso consentimento da </w:t>
       </w:r>
       <w:r>
         <w:rPr>
@@ -1793,15 +1447,7 @@
           <w:sz w:val="24"/>
           <w:szCs w:val="24"/>
         </w:rPr>
-        <w:t>Na hipótese de o veículo a</w:t>
-      </w:r>
-      <w:r>
-        <w:rPr>
-          <w:color w:val="000000"/>
-          <w:sz w:val="24"/>
-          <w:szCs w:val="24"/>
-        </w:rPr>
-        <w:t xml:space="preserve">inda estar na posse direta do </w:t>
+        <w:t xml:space="preserve">Na hipótese de o veículo ainda estar na posse direta do </w:t>
       </w:r>
       <w:r>
         <w:rPr>
@@ -1837,15 +1483,7 @@
           <w:sz w:val="24"/>
           <w:szCs w:val="24"/>
         </w:rPr>
-        <w:t>, o cliente deverá seguir rigorosamente as orientações técnicas fornecidas, sendo de sua total responsabil</w:t>
-      </w:r>
-      <w:r>
-        <w:rPr>
-          <w:color w:val="000000"/>
-          <w:sz w:val="24"/>
-          <w:szCs w:val="24"/>
-        </w:rPr>
-        <w:t>idade qualquer negligência que resulte na perda do objeto ou em prejuízo ao andamento processual planejado pela assessoria.</w:t>
+        <w:t>, o cliente deverá seguir rigorosamente as orientações técnicas fornecidas, sendo de sua total responsabilidade qualquer negligência que resulte na perda do objeto ou em prejuízo ao andamento processual planejado pela assessoria.</w:t>
       </w:r>
     </w:p>
     <w:p>
@@ -1922,15 +1560,7 @@
           <w:sz w:val="24"/>
           <w:szCs w:val="24"/>
         </w:rPr>
-        <w:t>, mantendo-o info</w:t>
-      </w:r>
-      <w:r>
-        <w:rPr>
-          <w:color w:val="000000"/>
-          <w:sz w:val="24"/>
-          <w:szCs w:val="24"/>
-        </w:rPr>
-        <w:t>rmado sobre os principais atos processuais e o estágio das negociações, sempre que solicitado.</w:t>
+        <w:t>, mantendo-o informado sobre os principais atos processuais e o estágio das negociações, sempre que solicitado.</w:t>
       </w:r>
     </w:p>
     <w:p>
@@ -1973,15 +1603,7 @@
           <w:sz w:val="24"/>
           <w:szCs w:val="24"/>
         </w:rPr>
-        <w:t xml:space="preserve"> elaborará as peças de defesa necessárias no processo judicial mencionado, visando con</w:t>
-      </w:r>
-      <w:r>
-        <w:rPr>
-          <w:color w:val="000000"/>
-          <w:sz w:val="24"/>
-          <w:szCs w:val="24"/>
-        </w:rPr>
-        <w:t>testar a mora, o valor cobrado e a própria validade da busca e apreensão, fundando sua atuação na legislação vigente, especialmente no Decreto-Lei nº 911/1969 e no Código de Defesa do Consumidor.</w:t>
+        <w:t xml:space="preserve"> elaborará as peças de defesa necessárias no processo judicial mencionado, visando contestar a mora, o valor cobrado e a própria validade da busca e apreensão, fundando sua atuação na legislação vigente, especialmente no Decreto-Lei nº 911/1969 e no Código de Defesa do Consumidor.</w:t>
       </w:r>
     </w:p>
     <w:p>
@@ -2024,15 +1646,7 @@
           <w:sz w:val="24"/>
           <w:szCs w:val="24"/>
         </w:rPr>
-        <w:t xml:space="preserve"> assume a obrigação de dar o destino final </w:t>
-      </w:r>
-      <w:r>
-        <w:rPr>
-          <w:color w:val="000000"/>
-          <w:sz w:val="24"/>
-          <w:szCs w:val="24"/>
-        </w:rPr>
-        <w:t xml:space="preserve">ao veículo transferido pelo </w:t>
+        <w:t xml:space="preserve"> assume a obrigação de dar o destino final ao veículo transferido pelo </w:t>
       </w:r>
       <w:r>
         <w:rPr>
@@ -2050,15 +1664,7 @@
           <w:sz w:val="24"/>
           <w:szCs w:val="24"/>
         </w:rPr>
-        <w:t>, responsabilizando-se pela quitação do contrato junto ao banco no tempo e modo que sua diretoria financeira julgar adequados, isentando o cliente de novos desembolsos financeiros a título de honorários ou custos de n</w:t>
-      </w:r>
-      <w:r>
-        <w:rPr>
-          <w:color w:val="000000"/>
-          <w:sz w:val="24"/>
-          <w:szCs w:val="24"/>
-        </w:rPr>
-        <w:t>egociação após a tradição do bem móvel.</w:t>
+        <w:t>, responsabilizando-se pela quitação do contrato junto ao banco no tempo e modo que sua diretoria financeira julgar adequados, isentando o cliente de novos desembolsos financeiros a título de honorários ou custos de negociação após a tradição do bem móvel.</w:t>
       </w:r>
     </w:p>
     <w:p>
@@ -2099,15 +1705,7 @@
           <w:sz w:val="24"/>
           <w:szCs w:val="24"/>
         </w:rPr>
-        <w:t>O presente contrato poderá ser rescindido por justo motivo caso qualquer uma das partes descumpra as obrigações fundamentais aqui estabelecidas. No caso de rescisão po</w:t>
-      </w:r>
-      <w:r>
-        <w:rPr>
-          <w:color w:val="000000"/>
-          <w:sz w:val="24"/>
-          <w:szCs w:val="24"/>
-        </w:rPr>
-        <w:t xml:space="preserve">r culpa do </w:t>
+        <w:t xml:space="preserve">O presente contrato poderá ser rescindido por justo motivo caso qualquer uma das partes descumpra as obrigações fundamentais aqui estabelecidas. No caso de rescisão por culpa do </w:t>
       </w:r>
       <w:r>
         <w:rPr>
@@ -2160,17 +1758,7 @@
           <w:sz w:val="24"/>
           <w:szCs w:val="24"/>
         </w:rPr>
-        <w:t>7.</w:t>
-      </w:r>
-      <w:r>
-        <w:rPr>
-          <w:b/>
-          <w:bCs/>
-          <w:color w:val="000000"/>
-          <w:sz w:val="24"/>
-          <w:szCs w:val="24"/>
-        </w:rPr>
-        <w:t xml:space="preserve">2. </w:t>
+        <w:t xml:space="preserve">7.2. </w:t>
       </w:r>
       <w:r>
         <w:rPr>
@@ -2214,15 +1802,7 @@
           <w:sz w:val="24"/>
           <w:szCs w:val="24"/>
         </w:rPr>
-        <w:t xml:space="preserve"> terá o direito de reter o bem ou o equivalente ao seu valor de mercado à época da contratação, </w:t>
-      </w:r>
-      <w:r>
-        <w:rPr>
-          <w:color w:val="000000"/>
-          <w:sz w:val="24"/>
-          <w:szCs w:val="24"/>
-        </w:rPr>
-        <w:t>tendo em vista o caráter irrevogável da dação em pagamento ajustada como honorários contratuais.</w:t>
+        <w:t xml:space="preserve"> terá o direito de reter o bem ou o equivalente ao seu valor de mercado à época da contratação, tendo em vista o caráter irrevogável da dação em pagamento ajustada como honorários contratuais.</w:t>
       </w:r>
     </w:p>
     <w:p>
@@ -2239,7 +1819,6 @@
           <w:sz w:val="24"/>
           <w:szCs w:val="24"/>
         </w:rPr>
-        <w:lastRenderedPageBreak/>
         <w:t xml:space="preserve">7.3. </w:t>
       </w:r>
       <w:r>
@@ -2266,15 +1845,7 @@
           <w:sz w:val="24"/>
           <w:szCs w:val="24"/>
         </w:rPr>
-        <w:t xml:space="preserve"> quanto ao fornecimento de documentos ou procurações indispensáveis ao cumprimento do objeto contratual, se não s</w:t>
-      </w:r>
-      <w:r>
-        <w:rPr>
-          <w:color w:val="000000"/>
-          <w:sz w:val="24"/>
-          <w:szCs w:val="24"/>
-        </w:rPr>
-        <w:t xml:space="preserve">anado no prazo de 5 (cinco) dias após notificado, autorizará a </w:t>
+        <w:t xml:space="preserve"> quanto ao fornecimento de documentos ou procurações indispensáveis ao cumprimento do objeto contratual, se não sanado no prazo de 5 (cinco) dias após notificado, autorizará a </w:t>
       </w:r>
       <w:r>
         <w:rPr>
@@ -2308,17 +1879,7 @@
           <w:sz w:val="24"/>
           <w:szCs w:val="24"/>
         </w:rPr>
-        <w:t>CLÁUSULA OITAVA – DAS CONDIÇÕES</w:t>
-      </w:r>
-      <w:r>
-        <w:rPr>
-          <w:b/>
-          <w:bCs/>
-          <w:color w:val="000000"/>
-          <w:sz w:val="24"/>
-          <w:szCs w:val="24"/>
-        </w:rPr>
-        <w:t xml:space="preserve"> GERAIS E DO FORO</w:t>
+        <w:t>CLÁUSULA OITAVA – DAS CONDIÇÕES GERAIS E DO FORO</w:t>
       </w:r>
     </w:p>
     <w:p>
@@ -2343,15 +1904,7 @@
           <w:sz w:val="24"/>
           <w:szCs w:val="24"/>
         </w:rPr>
-        <w:t>O presente instrumento constitui título executivo extrajudicial nos termos do Código de Processo Civil, sendo que qualquer tolerância de uma das partes quanto ao descumprimento de cláusulas contratuais pela outra não constituirá nova</w:t>
-      </w:r>
-      <w:r>
-        <w:rPr>
-          <w:color w:val="000000"/>
-          <w:sz w:val="24"/>
-          <w:szCs w:val="24"/>
-        </w:rPr>
-        <w:t>ção ou renúncia de direitos, mas mera liberalidade passageira.</w:t>
+        <w:t>O presente instrumento constitui título executivo extrajudicial nos termos do Código de Processo Civil, sendo que qualquer tolerância de uma das partes quanto ao descumprimento de cláusulas contratuais pela outra não constituirá novação ou renúncia de direitos, mas mera liberalidade passageira.</w:t>
       </w:r>
     </w:p>
     <w:p>
@@ -2408,15 +1961,6 @@
       </w:r>
       <w:r>
         <w:rPr>
-          <w:b/>
-          <w:bCs/>
-          <w:color w:val="000000"/>
-          <w:sz w:val="24"/>
-          <w:szCs w:val="24"/>
-        </w:rPr>
-      </w:r>
-      <w:r>
-        <w:rPr>
           <w:color w:val="000000"/>
           <w:sz w:val="24"/>
           <w:szCs w:val="24"/>
@@ -2482,15 +2026,7 @@
           <w:sz w:val="24"/>
           <w:szCs w:val="24"/>
         </w:rPr>
-        <w:t xml:space="preserve"> e seus parceiros e</w:t>
-      </w:r>
-      <w:r>
-        <w:rPr>
-          <w:color w:val="000000"/>
-          <w:sz w:val="24"/>
-          <w:szCs w:val="24"/>
-        </w:rPr>
-        <w:t>stritamente para a finalidade de execução deste contrato e atuação nos autos do processo judicial indicado, garantindo-se o sigilo e a segurança das informações.</w:t>
+        <w:t xml:space="preserve"> e seus parceiros estritamente para a finalidade de execução deste contrato e atuação nos autos do processo judicial indicado, garantindo-se o sigilo e a segurança das informações.</w:t>
       </w:r>
     </w:p>
     <w:p>
@@ -2515,15 +2051,7 @@
           <w:sz w:val="24"/>
           <w:szCs w:val="24"/>
         </w:rPr>
-        <w:t>Fica eleito o Foro da Comarca do Rio de Janeiro/RJ para dirimir quaisquer dúvidas ou lití</w:t>
-      </w:r>
-      <w:r>
-        <w:rPr>
-          <w:color w:val="000000"/>
-          <w:sz w:val="24"/>
-          <w:szCs w:val="24"/>
-        </w:rPr>
-        <w:t>gios oriundos deste instrumento, com renúncia expressa a qualquer outro, por mais privilegiado que seja.</w:t>
+        <w:t>Fica eleito o Foro da Comarca do Rio de Janeiro/RJ para dirimir quaisquer dúvidas ou litígios oriundos deste instrumento, com renúncia expressa a qualquer outro, por mais privilegiado que seja.</w:t>
       </w:r>
     </w:p>
     <w:p>
@@ -2537,15 +2065,7 @@
           <w:sz w:val="24"/>
           <w:szCs w:val="24"/>
         </w:rPr>
-        <w:t>E, por estarem assim justas e contratadas, as partes firmam o presente instrumento em 02 (duas) vias de igual teor e forma, na presença de duas testemu</w:t>
-      </w:r>
-      <w:r>
-        <w:rPr>
-          <w:color w:val="000000"/>
-          <w:sz w:val="24"/>
-          <w:szCs w:val="24"/>
-        </w:rPr>
-        <w:t>nhas, podendo este contrato ser assinado eletronicamente com plena validade jurídica nos termos da legislação vigente.</w:t>
+        <w:t>E, por estarem assim justas e contratadas, as partes firmam o presente instrumento em 02 (duas) vias de igual teor e forma, na presença de duas testemunhas, podendo este contrato ser assinado eletronicamente com plena validade jurídica nos termos da legislação vigente.</w:t>
       </w:r>
     </w:p>
     <w:p>
@@ -2554,9 +2074,6 @@
         <w:jc w:val="center"/>
       </w:pPr>
       <w:r>
-        <w:rPr>
-          <w:b w:val="0"/>
-        </w:rPr>
         <w:t>{{ local_data }}</w:t>
       </w:r>
     </w:p>
@@ -2590,52 +2107,39 @@
         <w:rPr>
           <w:b/>
           <w:bCs/>
-          <w:color w:val="000000"/>
-          <w:sz w:val="24"/>
-          <w:szCs w:val="24"/>
-        </w:rPr>
-      </w:pPr>
+          <w:sz w:val="24"/>
+          <w:szCs w:val="24"/>
+        </w:rPr>
+      </w:pPr>
+      <w:r>
+        <w:rPr>
+          <w:b/>
+          <w:bCs/>
+          <w:sz w:val="24"/>
+          <w:szCs w:val="24"/>
+        </w:rPr>
+        <w:t>______________________________________________________________</w:t>
+      </w:r>
     </w:p>
     <w:p>
       <w:pPr>
         <w:spacing w:before="480" w:after="80"/>
         <w:jc w:val="center"/>
-        <w:rPr>
-          <w:b/>
-          <w:bCs/>
-          <w:sz w:val="24"/>
-          <w:szCs w:val="24"/>
-        </w:rPr>
-      </w:pPr>
-      <w:r>
-        <w:rPr>
-          <w:b/>
-          <w:bCs/>
-          <w:sz w:val="24"/>
-          <w:szCs w:val="24"/>
-        </w:rPr>
-        <w:t>________________________________________________________________</w:t>
+      </w:pPr>
+      <w:r>
+        <w:rPr>
+          <w:b/>
+          <w:bCs/>
+          <w:color w:val="000000"/>
+          <w:sz w:val="24"/>
+          <w:szCs w:val="24"/>
+        </w:rPr>
+        <w:t>{{ nome }}</w:t>
       </w:r>
     </w:p>
     <w:p>
       <w:pPr>
         <w:spacing w:before="480" w:after="80"/>
-        <w:jc w:val="center"/>
-      </w:pPr>
-      <w:r>
-        <w:rPr>
-          <w:b/>
-          <w:bCs/>
-          <w:color w:val="000000"/>
-          <w:sz w:val="24"/>
-          <w:szCs w:val="24"/>
-        </w:rPr>
-        <w:t>{{ nome }}</w:t>
-      </w:r>
-    </w:p>
-    <w:p>
-      <w:pPr>
-        <w:spacing w:before="480" w:after="80"/>
       </w:pPr>
       <w:r>
         <w:rPr>
@@ -2659,15 +2163,7 @@
           <w:sz w:val="24"/>
           <w:szCs w:val="24"/>
         </w:rPr>
-        <w:t>Nome: _________________</w:t>
-      </w:r>
-      <w:r>
-        <w:rPr>
-          <w:color w:val="000000"/>
-          <w:sz w:val="24"/>
-          <w:szCs w:val="24"/>
-        </w:rPr>
-        <w:t>_____________</w:t>
+        <w:t>Nome: ______________________________</w:t>
       </w:r>
     </w:p>
     <w:p>
@@ -2710,7 +2206,6 @@
           <w:sz w:val="24"/>
           <w:szCs w:val="24"/>
         </w:rPr>
-        <w:lastRenderedPageBreak/>
         <w:t>2ª Testemunha</w:t>
       </w:r>
     </w:p>
@@ -2759,7 +2254,7 @@
     <w:sectPr>
       <w:footerReference w:type="default" r:id="rId7"/>
       <w:pgSz w:w="11906" w:h="16838"/>
-      <w:pgMar w:top="1134" w:right="1134" w:bottom="1701" w:left="1134" w:header="708" w:footer="708" w:gutter="0"/>
+      <w:pgMar w:top="284" w:right="1134" w:bottom="1701" w:left="1134" w:header="708" w:footer="708" w:gutter="0"/>
       <w:cols w:space="720"/>
       <w:docGrid w:linePitch="360"/>
     </w:sectPr>
@@ -2768,7 +2263,7 @@
 </file>
 
 <file path=word/endnotes.xml><?xml version="1.0" encoding="utf-8"?>
-<w:endnotes xmlns:wpc="http://schemas.microsoft.com/office/word/2010/wordprocessingCanvas" xmlns:cx="http://schemas.microsoft.com/office/drawing/2014/chartex" xmlns:cx1="http://schemas.microsoft.com/office/drawing/2015/9/8/chartex" xmlns:cx2="http://schemas.microsoft.com/office/drawing/2015/10/21/chartex" xmlns:cx3="http://schemas.microsoft.com/office/drawing/2016/5/9/chartex" xmlns:cx4="http://schemas.microsoft.com/office/drawing/2016/5/10/chartex" xmlns:cx5="http://schemas.microsoft.com/office/drawing/2016/5/11/chartex" xmlns:cx6="http://schemas.microsoft.com/office/drawing/2016/5/12/chartex" xmlns:cx7="http://schemas.microsoft.com/office/drawing/2016/5/13/chartex" xmlns:cx8="http://schemas.microsoft.com/office/drawing/2016/5/14/chartex" xmlns:mc="http://schemas.openxmlformats.org/markup-compatibility/2006" xmlns:aink="http://schemas.microsoft.com/office/drawing/2016/ink" xmlns:am3d="http://schemas.microsoft.com/office/drawing/2017/model3d" xmlns:o="urn:schemas-microsoft-com:office:office" xmlns:r="http://schemas.openxmlformats.org/officeDocument/2006/relationships" xmlns:m="http://schemas.openxmlformats.org/officeDocument/2006/math" xmlns:v="urn:schemas-microsoft-com:vml" xmlns:wp14="http://schemas.microsoft.com/office/word/2010/wordprocessingDrawing" xmlns:wp="http://schemas.openxmlformats.org/drawingml/2006/wordprocessingDrawing" xmlns:w10="urn:schemas-microsoft-com:office:word" xmlns:w="http://schemas.openxmlformats.org/wordprocessingml/2006/main" xmlns:w14="http://schemas.microsoft.com/office/word/2010/wordml" xmlns:w15="http://schemas.microsoft.com/office/word/2012/wordml" xmlns:w16cid="http://schemas.microsoft.com/office/word/2016/wordml/cid" xmlns:w16se="http://schemas.microsoft.com/office/word/2015/wordml/symex" xmlns:wpg="http://schemas.microsoft.com/office/word/2010/wordprocessingGroup" xmlns:wpi="http://schemas.microsoft.com/office/word/2010/wordprocessingInk" xmlns:wne="http://schemas.microsoft.com/office/word/2006/wordml" xmlns:wps="http://schemas.microsoft.com/office/word/2010/wordprocessingShape" mc:Ignorable="w14 w15 w16se w16cid wp14">
+<w:endnotes xmlns:wpc="http://schemas.microsoft.com/office/word/2010/wordprocessingCanvas" xmlns:cx="http://schemas.microsoft.com/office/drawing/2014/chartex" xmlns:cx1="http://schemas.microsoft.com/office/drawing/2015/9/8/chartex" xmlns:cx2="http://schemas.microsoft.com/office/drawing/2015/10/21/chartex" xmlns:cx3="http://schemas.microsoft.com/office/drawing/2016/5/9/chartex" xmlns:cx4="http://schemas.microsoft.com/office/drawing/2016/5/10/chartex" xmlns:cx5="http://schemas.microsoft.com/office/drawing/2016/5/11/chartex" xmlns:cx6="http://schemas.microsoft.com/office/drawing/2016/5/12/chartex" xmlns:cx7="http://schemas.microsoft.com/office/drawing/2016/5/13/chartex" xmlns:cx8="http://schemas.microsoft.com/office/drawing/2016/5/14/chartex" xmlns:mc="http://schemas.openxmlformats.org/markup-compatibility/2006" xmlns:aink="http://schemas.microsoft.com/office/drawing/2016/ink" xmlns:am3d="http://schemas.microsoft.com/office/drawing/2017/model3d" xmlns:o="urn:schemas-microsoft-com:office:office" xmlns:oel="http://schemas.microsoft.com/office/2019/extlst" xmlns:r="http://schemas.openxmlformats.org/officeDocument/2006/relationships" xmlns:m="http://schemas.openxmlformats.org/officeDocument/2006/math" xmlns:v="urn:schemas-microsoft-com:vml" xmlns:wp14="http://schemas.microsoft.com/office/word/2010/wordprocessingDrawing" xmlns:wp="http://schemas.openxmlformats.org/drawingml/2006/wordprocessingDrawing" xmlns:w10="urn:schemas-microsoft-com:office:word" xmlns:w="http://schemas.openxmlformats.org/wordprocessingml/2006/main" xmlns:w14="http://schemas.microsoft.com/office/word/2010/wordml" xmlns:w15="http://schemas.microsoft.com/office/word/2012/wordml" xmlns:w16cei="http://schemas.microsoft.com/office/word/2026/wordml/cei" xmlns:w16cex="http://schemas.microsoft.com/office/word/2018/wordml/cex" xmlns:w16cid="http://schemas.microsoft.com/office/word/2016/wordml/cid" xmlns:w16="http://schemas.microsoft.com/office/word/2018/wordml" xmlns:w16du="http://schemas.microsoft.com/office/word/2023/wordml/word16du" xmlns:w16sdtdh="http://schemas.microsoft.com/office/word/2020/wordml/sdtdatahash" xmlns:w16sdtfl="http://schemas.microsoft.com/office/word/2024/wordml/sdtformatlock" xmlns:w16se="http://schemas.microsoft.com/office/word/2015/wordml/symex" xmlns:wpg="http://schemas.microsoft.com/office/word/2010/wordprocessingGroup" xmlns:wpi="http://schemas.microsoft.com/office/word/2010/wordprocessingInk" xmlns:wne="http://schemas.microsoft.com/office/word/2006/wordml" xmlns:wps="http://schemas.microsoft.com/office/word/2010/wordprocessingShape" mc:Ignorable="w14 w15 w16se w16cid w16 w16cex w16sdtdh w16sdtfl w16du wp14">
   <w:endnote w:type="separator" w:id="-1">
     <w:p>
       <w:r>
@@ -2787,7 +2282,7 @@
 </file>
 
 <file path=word/footer1.xml><?xml version="1.0" encoding="utf-8"?>
-<w:ftr xmlns:wpc="http://schemas.microsoft.com/office/word/2010/wordprocessingCanvas" xmlns:cx="http://schemas.microsoft.com/office/drawing/2014/chartex" xmlns:cx1="http://schemas.microsoft.com/office/drawing/2015/9/8/chartex" xmlns:cx2="http://schemas.microsoft.com/office/drawing/2015/10/21/chartex" xmlns:cx3="http://schemas.microsoft.com/office/drawing/2016/5/9/chartex" xmlns:cx4="http://schemas.microsoft.com/office/drawing/2016/5/10/chartex" xmlns:cx5="http://schemas.microsoft.com/office/drawing/2016/5/11/chartex" xmlns:cx6="http://schemas.microsoft.com/office/drawing/2016/5/12/chartex" xmlns:cx7="http://schemas.microsoft.com/office/drawing/2016/5/13/chartex" xmlns:cx8="http://schemas.microsoft.com/office/drawing/2016/5/14/chartex" xmlns:mc="http://schemas.openxmlformats.org/markup-compatibility/2006" xmlns:aink="http://schemas.microsoft.com/office/drawing/2016/ink" xmlns:am3d="http://schemas.microsoft.com/office/drawing/2017/model3d" xmlns:o="urn:schemas-microsoft-com:office:office" xmlns:r="http://schemas.openxmlformats.org/officeDocument/2006/relationships" xmlns:m="http://schemas.openxmlformats.org/officeDocument/2006/math" xmlns:v="urn:schemas-microsoft-com:vml" xmlns:wp14="http://schemas.microsoft.com/office/word/2010/wordprocessingDrawing" xmlns:wp="http://schemas.openxmlformats.org/drawingml/2006/wordprocessingDrawing" xmlns:w10="urn:schemas-microsoft-com:office:word" xmlns:w="http://schemas.openxmlformats.org/wordprocessingml/2006/main" xmlns:w14="http://schemas.microsoft.com/office/word/2010/wordml" xmlns:w15="http://schemas.microsoft.com/office/word/2012/wordml" xmlns:w16cid="http://schemas.microsoft.com/office/word/2016/wordml/cid" xmlns:w16se="http://schemas.microsoft.com/office/word/2015/wordml/symex" xmlns:wpg="http://schemas.microsoft.com/office/word/2010/wordprocessingGroup" xmlns:wpi="http://schemas.microsoft.com/office/word/2010/wordprocessingInk" xmlns:wne="http://schemas.microsoft.com/office/word/2006/wordml" xmlns:wps="http://schemas.microsoft.com/office/word/2010/wordprocessingShape" mc:Ignorable="w14 w15 w16se w16cid wp14">
+<w:ftr xmlns:wpc="http://schemas.microsoft.com/office/word/2010/wordprocessingCanvas" xmlns:cx="http://schemas.microsoft.com/office/drawing/2014/chartex" xmlns:cx1="http://schemas.microsoft.com/office/drawing/2015/9/8/chartex" xmlns:cx2="http://schemas.microsoft.com/office/drawing/2015/10/21/chartex" xmlns:cx3="http://schemas.microsoft.com/office/drawing/2016/5/9/chartex" xmlns:cx4="http://schemas.microsoft.com/office/drawing/2016/5/10/chartex" xmlns:cx5="http://schemas.microsoft.com/office/drawing/2016/5/11/chartex" xmlns:cx6="http://schemas.microsoft.com/office/drawing/2016/5/12/chartex" xmlns:cx7="http://schemas.microsoft.com/office/drawing/2016/5/13/chartex" xmlns:cx8="http://schemas.microsoft.com/office/drawing/2016/5/14/chartex" xmlns:mc="http://schemas.openxmlformats.org/markup-compatibility/2006" xmlns:aink="http://schemas.microsoft.com/office/drawing/2016/ink" xmlns:am3d="http://schemas.microsoft.com/office/drawing/2017/model3d" xmlns:o="urn:schemas-microsoft-com:office:office" xmlns:oel="http://schemas.microsoft.com/office/2019/extlst" xmlns:r="http://schemas.openxmlformats.org/officeDocument/2006/relationships" xmlns:m="http://schemas.openxmlformats.org/officeDocument/2006/math" xmlns:v="urn:schemas-microsoft-com:vml" xmlns:wp14="http://schemas.microsoft.com/office/word/2010/wordprocessingDrawing" xmlns:wp="http://schemas.openxmlformats.org/drawingml/2006/wordprocessingDrawing" xmlns:w10="urn:schemas-microsoft-com:office:word" xmlns:w="http://schemas.openxmlformats.org/wordprocessingml/2006/main" xmlns:w14="http://schemas.microsoft.com/office/word/2010/wordml" xmlns:w15="http://schemas.microsoft.com/office/word/2012/wordml" xmlns:w16cei="http://schemas.microsoft.com/office/word/2026/wordml/cei" xmlns:w16cex="http://schemas.microsoft.com/office/word/2018/wordml/cex" xmlns:w16cid="http://schemas.microsoft.com/office/word/2016/wordml/cid" xmlns:w16="http://schemas.microsoft.com/office/word/2018/wordml" xmlns:w16du="http://schemas.microsoft.com/office/word/2023/wordml/word16du" xmlns:w16sdtdh="http://schemas.microsoft.com/office/word/2020/wordml/sdtdatahash" xmlns:w16sdtfl="http://schemas.microsoft.com/office/word/2024/wordml/sdtformatlock" xmlns:w16se="http://schemas.microsoft.com/office/word/2015/wordml/symex" xmlns:wpg="http://schemas.microsoft.com/office/word/2010/wordprocessingGroup" xmlns:wpi="http://schemas.microsoft.com/office/word/2010/wordprocessingInk" xmlns:wne="http://schemas.microsoft.com/office/word/2006/wordml" xmlns:wps="http://schemas.microsoft.com/office/word/2010/wordprocessingShape" mc:Ignorable="w14 w15 w16se w16cid w16 w16cex w16sdtdh w16sdtfl w16du wp14">
   <w:p>
     <w:pPr>
       <w:pBdr>
@@ -2864,7 +2359,7 @@
 </file>
 
 <file path=word/footnotes.xml><?xml version="1.0" encoding="utf-8"?>
-<w:footnotes xmlns:wpc="http://schemas.microsoft.com/office/word/2010/wordprocessingCanvas" xmlns:cx="http://schemas.microsoft.com/office/drawing/2014/chartex" xmlns:cx1="http://schemas.microsoft.com/office/drawing/2015/9/8/chartex" xmlns:cx2="http://schemas.microsoft.com/office/drawing/2015/10/21/chartex" xmlns:cx3="http://schemas.microsoft.com/office/drawing/2016/5/9/chartex" xmlns:cx4="http://schemas.microsoft.com/office/drawing/2016/5/10/chartex" xmlns:cx5="http://schemas.microsoft.com/office/drawing/2016/5/11/chartex" xmlns:cx6="http://schemas.microsoft.com/office/drawing/2016/5/12/chartex" xmlns:cx7="http://schemas.microsoft.com/office/drawing/2016/5/13/chartex" xmlns:cx8="http://schemas.microsoft.com/office/drawing/2016/5/14/chartex" xmlns:mc="http://schemas.openxmlformats.org/markup-compatibility/2006" xmlns:aink="http://schemas.microsoft.com/office/drawing/2016/ink" xmlns:am3d="http://schemas.microsoft.com/office/drawing/2017/model3d" xmlns:o="urn:schemas-microsoft-com:office:office" xmlns:r="http://schemas.openxmlformats.org/officeDocument/2006/relationships" xmlns:m="http://schemas.openxmlformats.org/officeDocument/2006/math" xmlns:v="urn:schemas-microsoft-com:vml" xmlns:wp14="http://schemas.microsoft.com/office/word/2010/wordprocessingDrawing" xmlns:wp="http://schemas.openxmlformats.org/drawingml/2006/wordprocessingDrawing" xmlns:w10="urn:schemas-microsoft-com:office:word" xmlns:w="http://schemas.openxmlformats.org/wordprocessingml/2006/main" xmlns:w14="http://schemas.microsoft.com/office/word/2010/wordml" xmlns:w15="http://schemas.microsoft.com/office/word/2012/wordml" xmlns:w16cid="http://schemas.microsoft.com/office/word/2016/wordml/cid" xmlns:w16se="http://schemas.microsoft.com/office/word/2015/wordml/symex" xmlns:wpg="http://schemas.microsoft.com/office/word/2010/wordprocessingGroup" xmlns:wpi="http://schemas.microsoft.com/office/word/2010/wordprocessingInk" xmlns:wne="http://schemas.microsoft.com/office/word/2006/wordml" xmlns:wps="http://schemas.microsoft.com/office/word/2010/wordprocessingShape" mc:Ignorable="w14 w15 w16se w16cid wp14">
+<w:footnotes xmlns:wpc="http://schemas.microsoft.com/office/word/2010/wordprocessingCanvas" xmlns:cx="http://schemas.microsoft.com/office/drawing/2014/chartex" xmlns:cx1="http://schemas.microsoft.com/office/drawing/2015/9/8/chartex" xmlns:cx2="http://schemas.microsoft.com/office/drawing/2015/10/21/chartex" xmlns:cx3="http://schemas.microsoft.com/office/drawing/2016/5/9/chartex" xmlns:cx4="http://schemas.microsoft.com/office/drawing/2016/5/10/chartex" xmlns:cx5="http://schemas.microsoft.com/office/drawing/2016/5/11/chartex" xmlns:cx6="http://schemas.microsoft.com/office/drawing/2016/5/12/chartex" xmlns:cx7="http://schemas.microsoft.com/office/drawing/2016/5/13/chartex" xmlns:cx8="http://schemas.microsoft.com/office/drawing/2016/5/14/chartex" xmlns:mc="http://schemas.openxmlformats.org/markup-compatibility/2006" xmlns:aink="http://schemas.microsoft.com/office/drawing/2016/ink" xmlns:am3d="http://schemas.microsoft.com/office/drawing/2017/model3d" xmlns:o="urn:schemas-microsoft-com:office:office" xmlns:oel="http://schemas.microsoft.com/office/2019/extlst" xmlns:r="http://schemas.openxmlformats.org/officeDocument/2006/relationships" xmlns:m="http://schemas.openxmlformats.org/officeDocument/2006/math" xmlns:v="urn:schemas-microsoft-com:vml" xmlns:wp14="http://schemas.microsoft.com/office/word/2010/wordprocessingDrawing" xmlns:wp="http://schemas.openxmlformats.org/drawingml/2006/wordprocessingDrawing" xmlns:w10="urn:schemas-microsoft-com:office:word" xmlns:w="http://schemas.openxmlformats.org/wordprocessingml/2006/main" xmlns:w14="http://schemas.microsoft.com/office/word/2010/wordml" xmlns:w15="http://schemas.microsoft.com/office/word/2012/wordml" xmlns:w16cei="http://schemas.microsoft.com/office/word/2026/wordml/cei" xmlns:w16cex="http://schemas.microsoft.com/office/word/2018/wordml/cex" xmlns:w16cid="http://schemas.microsoft.com/office/word/2016/wordml/cid" xmlns:w16="http://schemas.microsoft.com/office/word/2018/wordml" xmlns:w16du="http://schemas.microsoft.com/office/word/2023/wordml/word16du" xmlns:w16sdtdh="http://schemas.microsoft.com/office/word/2020/wordml/sdtdatahash" xmlns:w16sdtfl="http://schemas.microsoft.com/office/word/2024/wordml/sdtformatlock" xmlns:w16se="http://schemas.microsoft.com/office/word/2015/wordml/symex" xmlns:wpg="http://schemas.microsoft.com/office/word/2010/wordprocessingGroup" xmlns:wpi="http://schemas.microsoft.com/office/word/2010/wordprocessingInk" xmlns:wne="http://schemas.microsoft.com/office/word/2006/wordml" xmlns:wps="http://schemas.microsoft.com/office/word/2010/wordprocessingShape" mc:Ignorable="w14 w15 w16se w16cid w16 w16cex w16sdtdh w16sdtfl w16du wp14">
   <w:footnote w:type="separator" w:id="-1">
     <w:p>
       <w:r>
@@ -2883,7 +2378,7 @@
 </file>
 
 <file path=word/numbering.xml><?xml version="1.0" encoding="utf-8"?>
-<w:numbering xmlns:wpc="http://schemas.microsoft.com/office/word/2010/wordprocessingCanvas" xmlns:cx="http://schemas.microsoft.com/office/drawing/2014/chartex" xmlns:cx1="http://schemas.microsoft.com/office/drawing/2015/9/8/chartex" xmlns:cx2="http://schemas.microsoft.com/office/drawing/2015/10/21/chartex" xmlns:cx3="http://schemas.microsoft.com/office/drawing/2016/5/9/chartex" xmlns:cx4="http://schemas.microsoft.com/office/drawing/2016/5/10/chartex" xmlns:cx5="http://schemas.microsoft.com/office/drawing/2016/5/11/chartex" xmlns:cx6="http://schemas.microsoft.com/office/drawing/2016/5/12/chartex" xmlns:cx7="http://schemas.microsoft.com/office/drawing/2016/5/13/chartex" xmlns:cx8="http://schemas.microsoft.com/office/drawing/2016/5/14/chartex" xmlns:mc="http://schemas.openxmlformats.org/markup-compatibility/2006" xmlns:aink="http://schemas.microsoft.com/office/drawing/2016/ink" xmlns:am3d="http://schemas.microsoft.com/office/drawing/2017/model3d" xmlns:o="urn:schemas-microsoft-com:office:office" xmlns:r="http://schemas.openxmlformats.org/officeDocument/2006/relationships" xmlns:m="http://schemas.openxmlformats.org/officeDocument/2006/math" xmlns:v="urn:schemas-microsoft-com:vml" xmlns:wp14="http://schemas.microsoft.com/office/word/2010/wordprocessingDrawing" xmlns:wp="http://schemas.openxmlformats.org/drawingml/2006/wordprocessingDrawing" xmlns:w10="urn:schemas-microsoft-com:office:word" xmlns:w="http://schemas.openxmlformats.org/wordprocessingml/2006/main" xmlns:w14="http://schemas.microsoft.com/office/word/2010/wordml" xmlns:w15="http://schemas.microsoft.com/office/word/2012/wordml" xmlns:w16cid="http://schemas.microsoft.com/office/word/2016/wordml/cid" xmlns:w16se="http://schemas.microsoft.com/office/word/2015/wordml/symex" xmlns:wpg="http://schemas.microsoft.com/office/word/2010/wordprocessingGroup" xmlns:wpi="http://schemas.microsoft.com/office/word/2010/wordprocessingInk" xmlns:wne="http://schemas.microsoft.com/office/word/2006/wordml" xmlns:wps="http://schemas.microsoft.com/office/word/2010/wordprocessingShape" mc:Ignorable="w14 w15 w16se w16cid wp14">
+<w:numbering xmlns:wpc="http://schemas.microsoft.com/office/word/2010/wordprocessingCanvas" xmlns:cx="http://schemas.microsoft.com/office/drawing/2014/chartex" xmlns:cx1="http://schemas.microsoft.com/office/drawing/2015/9/8/chartex" xmlns:cx2="http://schemas.microsoft.com/office/drawing/2015/10/21/chartex" xmlns:cx3="http://schemas.microsoft.com/office/drawing/2016/5/9/chartex" xmlns:cx4="http://schemas.microsoft.com/office/drawing/2016/5/10/chartex" xmlns:cx5="http://schemas.microsoft.com/office/drawing/2016/5/11/chartex" xmlns:cx6="http://schemas.microsoft.com/office/drawing/2016/5/12/chartex" xmlns:cx7="http://schemas.microsoft.com/office/drawing/2016/5/13/chartex" xmlns:cx8="http://schemas.microsoft.com/office/drawing/2016/5/14/chartex" xmlns:mc="http://schemas.openxmlformats.org/markup-compatibility/2006" xmlns:aink="http://schemas.microsoft.com/office/drawing/2016/ink" xmlns:am3d="http://schemas.microsoft.com/office/drawing/2017/model3d" xmlns:o="urn:schemas-microsoft-com:office:office" xmlns:oel="http://schemas.microsoft.com/office/2019/extlst" xmlns:r="http://schemas.openxmlformats.org/officeDocument/2006/relationships" xmlns:m="http://schemas.openxmlformats.org/officeDocument/2006/math" xmlns:v="urn:schemas-microsoft-com:vml" xmlns:wp14="http://schemas.microsoft.com/office/word/2010/wordprocessingDrawing" xmlns:wp="http://schemas.openxmlformats.org/drawingml/2006/wordprocessingDrawing" xmlns:w10="urn:schemas-microsoft-com:office:word" xmlns:w="http://schemas.openxmlformats.org/wordprocessingml/2006/main" xmlns:w14="http://schemas.microsoft.com/office/word/2010/wordml" xmlns:w15="http://schemas.microsoft.com/office/word/2012/wordml" xmlns:w16cei="http://schemas.microsoft.com/office/word/2026/wordml/cei" xmlns:w16cex="http://schemas.microsoft.com/office/word/2018/wordml/cex" xmlns:w16cid="http://schemas.microsoft.com/office/word/2016/wordml/cid" xmlns:w16="http://schemas.microsoft.com/office/word/2018/wordml" xmlns:w16du="http://schemas.microsoft.com/office/word/2023/wordml/word16du" xmlns:w16sdtdh="http://schemas.microsoft.com/office/word/2020/wordml/sdtdatahash" xmlns:w16sdtfl="http://schemas.microsoft.com/office/word/2024/wordml/sdtformatlock" xmlns:w16se="http://schemas.microsoft.com/office/word/2015/wordml/symex" xmlns:wpg="http://schemas.microsoft.com/office/word/2010/wordprocessingGroup" xmlns:wpi="http://schemas.microsoft.com/office/word/2010/wordprocessingInk" xmlns:wne="http://schemas.microsoft.com/office/word/2006/wordml" xmlns:wps="http://schemas.microsoft.com/office/word/2010/wordprocessingShape" mc:Ignorable="w14 w15 w16se w16cid w16 w16cex w16sdtdh w16sdtfl w16du wp14">
   <w:abstractNum w:abstractNumId="0" w15:restartNumberingAfterBreak="0">
     <w:nsid w:val="3EC95CF4"/>
     <w:multiLevelType w:val="hybridMultilevel"/>
@@ -2970,7 +2465,7 @@
       </w:pPr>
     </w:lvl>
   </w:abstractNum>
-  <w:num w:numId="1">
+  <w:num w:numId="1" w16cid:durableId="1350719057">
     <w:abstractNumId w:val="0"/>
     <w:lvlOverride w:ilvl="0">
       <w:startOverride w:val="1"/>
@@ -2980,7 +2475,7 @@
 </file>
 
 <file path=word/styles.xml><?xml version="1.0" encoding="utf-8"?>
-<w:styles xmlns:mc="http://schemas.openxmlformats.org/markup-compatibility/2006" xmlns:r="http://schemas.openxmlformats.org/officeDocument/2006/relationships" xmlns:w="http://schemas.openxmlformats.org/wordprocessingml/2006/main" xmlns:w14="http://schemas.microsoft.com/office/word/2010/wordml" xmlns:w15="http://schemas.microsoft.com/office/word/2012/wordml" xmlns:w16cid="http://schemas.microsoft.com/office/word/2016/wordml/cid" xmlns:w16se="http://schemas.microsoft.com/office/word/2015/wordml/symex" mc:Ignorable="w14 w15 w16se w16cid">
+<w:styles xmlns:mc="http://schemas.openxmlformats.org/markup-compatibility/2006" xmlns:r="http://schemas.openxmlformats.org/officeDocument/2006/relationships" xmlns:w="http://schemas.openxmlformats.org/wordprocessingml/2006/main" xmlns:w14="http://schemas.microsoft.com/office/word/2010/wordml" xmlns:w15="http://schemas.microsoft.com/office/word/2012/wordml" xmlns:w16cex="http://schemas.microsoft.com/office/word/2018/wordml/cex" xmlns:w16cid="http://schemas.microsoft.com/office/word/2016/wordml/cid" xmlns:w16="http://schemas.microsoft.com/office/word/2018/wordml" xmlns:w16du="http://schemas.microsoft.com/office/word/2023/wordml/word16du" xmlns:w16sdtdh="http://schemas.microsoft.com/office/word/2020/wordml/sdtdatahash" xmlns:w16sdtfl="http://schemas.microsoft.com/office/word/2024/wordml/sdtformatlock" xmlns:w16se="http://schemas.microsoft.com/office/word/2015/wordml/symex" mc:Ignorable="w14 w15 w16se w16cid w16 w16cex w16sdtdh w16sdtfl w16du">
   <w:docDefaults>
     <w:rPrDefault>
       <w:rPr>

</xml_diff>